<commit_message>
Add Martabe copper loading test and resin activity KCN variant to SWI 205-013, 205-012
Co-Authored-By: Claude Sonnet 5.5 <noreply@anthropic.com>
Claude-Session: https://claude.ai/code/session_0121qocWgsZdFAsne2oz9sHT
</commit_message>
<xml_diff>
--- a/SWI/205-Chemical-Testwork/MM-4034-033-OR-03-SWI-PRO-MET-205-012-Resin-Adsorption-Capacity-and-Kinetics-Test-RevA.docx
+++ b/SWI/205-Chemical-Testwork/MM-4034-033-OR-03-SWI-PRO-MET-205-012-Resin-Adsorption-Capacity-and-Kinetics-Test-RevA.docx
@@ -1867,6 +1867,24 @@
     </w:p>
     <w:p>
       <w:pPr>
+        <w:pStyle w:val="ListParagraph"/>
+        <w:numPr>
+          <w:ilvl w:val="0"/>
+          <w:numId w:val="1"/>
+        </w:numPr>
+        <w:spacing w:after="60" w:line="245"/>
+      </w:pPr>
+      <w:r>
+        <w:rPr>
+          <w:rFonts w:ascii="Calibri" w:cs="Calibri" w:eastAsia="Calibri" w:hAnsi="Calibri"/>
+          <w:sz w:val="17"/>
+          <w:szCs w:val="17"/>
+        </w:rPr>
+        <w:t xml:space="preserve">[M] KCN (KCN variant only)</w:t>
+      </w:r>
+    </w:p>
+    <w:p>
+      <w:pPr>
         <w:pStyle w:val="Heading1"/>
         <w:spacing w:after="120" w:before="260"/>
       </w:pPr>
@@ -1892,7 +1910,7 @@
           <w:sz w:val="17"/>
           <w:szCs w:val="17"/>
         </w:rPr>
-        <w:t xml:space="preserve">[M] = taken from the Martabe team work instruction "Resin activity test (file name 'Work_Instruction_Ball_Mill_Cyclone_Profile')" (03/03/2025). [CONFIRM] = unspecified or inconsistent in the source; resolve before this instruction is approved for use.</w:t>
+        <w:t xml:space="preserve">[M] = taken from the Martabe team work instruction "Resin activity test" (03/03/2025). [CONFIRM] = unspecified or inconsistent in the source; resolve before this instruction is approved for use.</w:t>
       </w:r>
     </w:p>
     <w:p>
@@ -1905,7 +1923,7 @@
           <w:sz w:val="17"/>
           <w:szCs w:val="17"/>
         </w:rPr>
-        <w:t xml:space="preserve">Purpose [M]: compare the adsorption kinetics of each resin sample (loaded and Cu-eluted) against fresh resin. [CONFIRM] the Martabe file name refers to a ball mill cyclone profile but the content is this resin activity test.</w:t>
+        <w:t xml:space="preserve">Purpose [M]: compare the adsorption kinetics of each resin sample (loaded and Cu-eluted) against fresh resin.</w:t>
       </w:r>
     </w:p>
     <w:p>
@@ -2356,6 +2374,19 @@
           <w:szCs w:val="17"/>
         </w:rPr>
         <w:t xml:space="preserve">  Run fresh resin as the reference, then the loaded and Cu-eluted samples. Record on 'G:\Processing\5. Metallurgy\Metallurgy Lab\04 Metlab Data\Resin\5. Copper Loading Activity Test.xlsx' (columns: time, initial, sample and final volume, solution pH, NaCN mg/L).</w:t>
+      </w:r>
+    </w:p>
+    <w:p>
+      <w:pPr>
+        <w:spacing w:after="60" w:before="0" w:line="245"/>
+      </w:pPr>
+      <w:r>
+        <w:rPr>
+          <w:rFonts w:ascii="Calibri" w:cs="Calibri" w:eastAsia="Calibri" w:hAnsi="Calibri"/>
+          <w:sz w:val="17"/>
+          <w:szCs w:val="17"/>
+        </w:rPr>
+        <w:t xml:space="preserve">KCN variant [M]: a later Martabe version, 'Resin activity test KCN' (dated '03/012/2025' - [CONFIRM] date), is identical except that it prepares 4 g KCN in place of 2 g NaCN. Its step text still says 'NaCN'. [CONFIRM] which reagent and mass is current: 4 g KCN is about 0.061 mol of cyanide against about 0.041 mol for 2 g NaCN (1.5 times), and 2.66 g KCN would be the molar equivalent. Do not run the KCN variant until this is settled.</w:t>
       </w:r>
     </w:p>
     <w:p>
@@ -2604,7 +2635,7 @@
           <w:sz w:val="17"/>
           <w:szCs w:val="17"/>
         </w:rPr>
-        <w:t xml:space="preserve">Martabe work instruction 'Resin activity test' (Indonesian, 03/03/2025, file name 'Work_Instruction_Ball_Mill_Cyclone_Profile') - method source</w:t>
+        <w:t xml:space="preserve">Martabe work instruction 'Resin activity test' (Indonesian, 03/03/2025) and its KCN version (dated 03/012/2025) - method source</w:t>
       </w:r>
     </w:p>
     <w:sectPr>

</xml_diff>